<commit_message>
No technology licence/royalty: fold know-how into equipment/partnership
Per the deal reality, there is no separate technology licence or royalty
stream. Removed licence/royalty from the questionnaire and plan:
- Q0.2 deal-structure options are now EPC turnkey (equipment + technology
  bundled) or JV equity (partner contributes technology + equipment),
  explicitly "no separate licence/royalty".
- Replaced the licence-terms question with how know-how transfers and is
  secured without a licence (process manual, training, resident
  engineers, technical-support agreement) plus ongoing support terms.
- Renamed section 2 to "Technology, know-how and technical support".
- Plan step 0.2 reworded: technology comes bundled with equipment supply,
  no separate licence.

Co-Authored-By: Claude Opus 4.8 <noreply@anthropic.com>
Claude-Session: https://claude.ai/code/session_01KMpMivcZ9Nn7TrjWCAqheY
</commit_message>
<xml_diff>
--- a/waste-oil-balkans/dist/02_Plan_realizacii.docx
+++ b/waste-oil-balkans/dist/02_Plan_realizacii.docx
@@ -428,7 +428,7 @@
               <w:jc w:val="left"/>
             </w:pPr>
             <w:r>
-              <w:t xml:space="preserve">Соглашение с партнёром: технология, поставка, шефмонтаж, лицензия ноу-хау</w:t>
+              <w:t xml:space="preserve">Соглашение с партнёром: технология + поставка оборудования + шефмонтаж (без отдельной лицензии — технология в комплекте/во вкладе)</w:t>
             </w:r>
           </w:p>
         </w:tc>
@@ -470,7 +470,7 @@
               <w:jc w:val="left"/>
             </w:pPr>
             <w:r>
-              <w:t xml:space="preserve">гарантии выхода и качества Group II; опцион на модули этапов 2–3</w:t>
+              <w:t xml:space="preserve">гарантии выхода и качества Group II; техподдержка; опцион на модули этапов 2–3</w:t>
             </w:r>
           </w:p>
         </w:tc>

</xml_diff>